<commit_message>
docs: update README and project docs to S-10 — exe, protobuf, build guide
</commit_message>
<xml_diff>
--- a/03_Project_Plan.docx
+++ b/03_Project_Plan.docx
@@ -46,7 +46,7 @@
           <w:sz w:val="22"/>
           <w:szCs w:val="22"/>
         </w:rPr>
-        <w:t xml:space="preserve">Version 1.1 — S-09 Complete</w:t>
+        <w:t xml:space="preserve">Version 1.1 — S-10 Complete</w:t>
       </w:r>
     </w:p>
     <w:p>
@@ -95,7 +95,7 @@
           <w:sz w:val="22"/>
           <w:szCs w:val="22"/>
         </w:rPr>
-        <w:t xml:space="preserve">The DITA Converter Tool was built as a one-day proof-of-concept demonstrating viable PDF/DOCX to DITA 2.0 conversion. The project has been extended across nine sessions, all reviewer-approved.</w:t>
+        <w:t xml:space="preserve">The DITA Converter Tool was built as a one-day proof-of-concept demonstrating viable PDF/DOCX to DITA 2.0 conversion. The project has been extended across ten sessions, all reviewer-approved.</w:t>
       </w:r>
     </w:p>
     <w:tbl>
@@ -350,7 +350,7 @@
                 <w:sz w:val="20"/>
                 <w:szCs w:val="20"/>
               </w:rPr>
-              <w:t xml:space="preserve">v1.1 — Live on Streamlit Cloud</w:t>
+              <w:t xml:space="preserve">v1.1 — Live on Streamlit Cloud + Windows exe</w:t>
             </w:r>
           </w:p>
         </w:tc>
@@ -524,7 +524,7 @@
                 <w:sz w:val="20"/>
                 <w:szCs w:val="20"/>
               </w:rPr>
-              <w:t xml:space="preserve">9 (S-01 through S-09)</w:t>
+              <w:t xml:space="preserve">10 (S-01 through S-10)</w:t>
             </w:r>
           </w:p>
         </w:tc>
@@ -1728,6 +1728,120 @@
           </w:p>
         </w:tc>
       </w:tr>
+      <w:tr>
+        <w:tc>
+          <w:tcPr>
+            <w:tcW w:type="dxa" w:w="900"/>
+            <w:tcBorders>
+              <w:top w:val="single" w:color="CCCCCC" w:sz="1"/>
+              <w:left w:val="single" w:color="CCCCCC" w:sz="1"/>
+              <w:bottom w:val="single" w:color="CCCCCC" w:sz="1"/>
+              <w:right w:val="single" w:color="CCCCCC" w:sz="1"/>
+            </w:tcBorders>
+            <w:shd w:fill="FFFFFF" w:val="clear"/>
+            <w:tcMar>
+              <w:top w:type="dxa" w:w="80"/>
+              <w:left w:type="dxa" w:w="120"/>
+              <w:bottom w:type="dxa" w:w="80"/>
+              <w:right w:type="dxa" w:w="120"/>
+            </w:tcMar>
+          </w:tcPr>
+          <w:p>
+            <w:r>
+              <w:rPr>
+                <w:rFonts w:ascii="Arial" w:cs="Arial" w:eastAsia="Arial" w:hAnsi="Arial"/>
+                <w:sz w:val="20"/>
+                <w:szCs w:val="20"/>
+              </w:rPr>
+              <w:t xml:space="preserve">S-10</w:t>
+            </w:r>
+          </w:p>
+        </w:tc>
+        <w:tc>
+          <w:tcPr>
+            <w:tcW w:type="dxa" w:w="2400"/>
+            <w:tcBorders>
+              <w:top w:val="single" w:color="CCCCCC" w:sz="1"/>
+              <w:left w:val="single" w:color="CCCCCC" w:sz="1"/>
+              <w:bottom w:val="single" w:color="CCCCCC" w:sz="1"/>
+              <w:right w:val="single" w:color="CCCCCC" w:sz="1"/>
+            </w:tcBorders>
+            <w:shd w:fill="FFFFFF" w:val="clear"/>
+            <w:tcMar>
+              <w:top w:type="dxa" w:w="80"/>
+              <w:left w:type="dxa" w:w="120"/>
+              <w:bottom w:type="dxa" w:w="80"/>
+              <w:right w:type="dxa" w:w="120"/>
+            </w:tcMar>
+          </w:tcPr>
+          <w:p>
+            <w:r>
+              <w:rPr>
+                <w:rFonts w:ascii="Arial" w:cs="Arial" w:eastAsia="Arial" w:hAnsi="Arial"/>
+                <w:sz w:val="20"/>
+                <w:szCs w:val="20"/>
+              </w:rPr>
+              <w:t xml:space="preserve">Windows Executable</w:t>
+            </w:r>
+          </w:p>
+        </w:tc>
+        <w:tc>
+          <w:tcPr>
+            <w:tcW w:type="dxa" w:w="4260"/>
+            <w:tcBorders>
+              <w:top w:val="single" w:color="CCCCCC" w:sz="1"/>
+              <w:left w:val="single" w:color="CCCCCC" w:sz="1"/>
+              <w:bottom w:val="single" w:color="CCCCCC" w:sz="1"/>
+              <w:right w:val="single" w:color="CCCCCC" w:sz="1"/>
+            </w:tcBorders>
+            <w:shd w:fill="FFFFFF" w:val="clear"/>
+            <w:tcMar>
+              <w:top w:type="dxa" w:w="80"/>
+              <w:left w:type="dxa" w:w="120"/>
+              <w:bottom w:type="dxa" w:w="80"/>
+              <w:right w:type="dxa" w:w="120"/>
+            </w:tcMar>
+          </w:tcPr>
+          <w:p>
+            <w:r>
+              <w:rPr>
+                <w:rFonts w:ascii="Arial" w:cs="Arial" w:eastAsia="Arial" w:hAnsi="Arial"/>
+                <w:sz w:val="20"/>
+                <w:szCs w:val="20"/>
+              </w:rPr>
+              <w:t xml:space="preserve">PyInstaller build script, launcher, IT cert guide, Git LFS, protobuf pin</w:t>
+            </w:r>
+          </w:p>
+        </w:tc>
+        <w:tc>
+          <w:tcPr>
+            <w:tcW w:type="dxa" w:w="1800"/>
+            <w:tcBorders>
+              <w:top w:val="single" w:color="CCCCCC" w:sz="1"/>
+              <w:left w:val="single" w:color="CCCCCC" w:sz="1"/>
+              <w:bottom w:val="single" w:color="CCCCCC" w:sz="1"/>
+              <w:right w:val="single" w:color="CCCCCC" w:sz="1"/>
+            </w:tcBorders>
+            <w:shd w:fill="FFFFFF" w:val="clear"/>
+            <w:tcMar>
+              <w:top w:type="dxa" w:w="80"/>
+              <w:left w:type="dxa" w:w="120"/>
+              <w:bottom w:type="dxa" w:w="80"/>
+              <w:right w:type="dxa" w:w="120"/>
+            </w:tcMar>
+          </w:tcPr>
+          <w:p>
+            <w:r>
+              <w:rPr>
+                <w:rFonts w:ascii="Arial" w:cs="Arial" w:eastAsia="Arial" w:hAnsi="Arial"/>
+                <w:sz w:val="20"/>
+                <w:szCs w:val="20"/>
+              </w:rPr>
+              <w:t xml:space="preserve">✅ Complete</w:t>
+            </w:r>
+          </w:p>
+        </w:tc>
+      </w:tr>
     </w:tbl>
     <w:p>
       <w:pPr>
@@ -1756,7 +1870,7 @@
     </w:p>
     <w:tbl>
       <w:tblPr>
-        <w:tblW w:type="dxa" w:w="9360"/>
+        <w:tblW w:type="dxa" w:w="8560"/>
         <w:tblBorders>
           <w:top w:val="single" w:color="auto" w:sz="4"/>
           <w:left w:val="single" w:color="auto" w:sz="4"/>
@@ -1767,10 +1881,10 @@
         </w:tblBorders>
       </w:tblPr>
       <w:tblGrid>
-        <w:gridCol w:w="2500"/>
-        <w:gridCol w:w="3000"/>
+        <w:gridCol w:w="2200"/>
+        <w:gridCol w:w="2800"/>
         <w:gridCol w:w="2760"/>
-        <w:gridCol w:w="1100"/>
+        <w:gridCol w:w="800"/>
       </w:tblGrid>
       <w:tr>
         <w:trPr>
@@ -1778,7 +1892,7 @@
         </w:trPr>
         <w:tc>
           <w:tcPr>
-            <w:tcW w:type="dxa" w:w="2500"/>
+            <w:tcW w:type="dxa" w:w="2200"/>
             <w:tcBorders>
               <w:top w:val="single" w:color="CCCCCC" w:sz="1"/>
               <w:left w:val="single" w:color="CCCCCC" w:sz="1"/>
@@ -1809,7 +1923,7 @@
         </w:tc>
         <w:tc>
           <w:tcPr>
-            <w:tcW w:type="dxa" w:w="3000"/>
+            <w:tcW w:type="dxa" w:w="2800"/>
             <w:tcBorders>
               <w:top w:val="single" w:color="CCCCCC" w:sz="1"/>
               <w:left w:val="single" w:color="CCCCCC" w:sz="1"/>
@@ -1871,7 +1985,7 @@
         </w:tc>
         <w:tc>
           <w:tcPr>
-            <w:tcW w:type="dxa" w:w="1100"/>
+            <w:tcW w:type="dxa" w:w="800"/>
             <w:tcBorders>
               <w:top w:val="single" w:color="CCCCCC" w:sz="1"/>
               <w:left w:val="single" w:color="CCCCCC" w:sz="1"/>
@@ -1904,7 +2018,7 @@
       <w:tr>
         <w:tc>
           <w:tcPr>
-            <w:tcW w:type="dxa" w:w="2500"/>
+            <w:tcW w:type="dxa" w:w="2200"/>
             <w:tcBorders>
               <w:top w:val="single" w:color="CCCCCC" w:sz="1"/>
               <w:left w:val="single" w:color="CCCCCC" w:sz="1"/>
@@ -1932,7 +2046,7 @@
         </w:tc>
         <w:tc>
           <w:tcPr>
-            <w:tcW w:type="dxa" w:w="3000"/>
+            <w:tcW w:type="dxa" w:w="2800"/>
             <w:tcBorders>
               <w:top w:val="single" w:color="CCCCCC" w:sz="1"/>
               <w:left w:val="single" w:color="CCCCCC" w:sz="1"/>
@@ -1988,7 +2102,7 @@
         </w:tc>
         <w:tc>
           <w:tcPr>
-            <w:tcW w:type="dxa" w:w="1100"/>
+            <w:tcW w:type="dxa" w:w="800"/>
             <w:tcBorders>
               <w:top w:val="single" w:color="CCCCCC" w:sz="1"/>
               <w:left w:val="single" w:color="CCCCCC" w:sz="1"/>
@@ -2018,7 +2132,7 @@
       <w:tr>
         <w:tc>
           <w:tcPr>
-            <w:tcW w:type="dxa" w:w="2500"/>
+            <w:tcW w:type="dxa" w:w="2200"/>
             <w:tcBorders>
               <w:top w:val="single" w:color="CCCCCC" w:sz="1"/>
               <w:left w:val="single" w:color="CCCCCC" w:sz="1"/>
@@ -2046,7 +2160,7 @@
         </w:tc>
         <w:tc>
           <w:tcPr>
-            <w:tcW w:type="dxa" w:w="3000"/>
+            <w:tcW w:type="dxa" w:w="2800"/>
             <w:tcBorders>
               <w:top w:val="single" w:color="CCCCCC" w:sz="1"/>
               <w:left w:val="single" w:color="CCCCCC" w:sz="1"/>
@@ -2102,7 +2216,7 @@
         </w:tc>
         <w:tc>
           <w:tcPr>
-            <w:tcW w:type="dxa" w:w="1100"/>
+            <w:tcW w:type="dxa" w:w="800"/>
             <w:tcBorders>
               <w:top w:val="single" w:color="CCCCCC" w:sz="1"/>
               <w:left w:val="single" w:color="CCCCCC" w:sz="1"/>
@@ -2132,7 +2246,7 @@
       <w:tr>
         <w:tc>
           <w:tcPr>
-            <w:tcW w:type="dxa" w:w="2500"/>
+            <w:tcW w:type="dxa" w:w="2200"/>
             <w:tcBorders>
               <w:top w:val="single" w:color="CCCCCC" w:sz="1"/>
               <w:left w:val="single" w:color="CCCCCC" w:sz="1"/>
@@ -2160,7 +2274,7 @@
         </w:tc>
         <w:tc>
           <w:tcPr>
-            <w:tcW w:type="dxa" w:w="3000"/>
+            <w:tcW w:type="dxa" w:w="2800"/>
             <w:tcBorders>
               <w:top w:val="single" w:color="CCCCCC" w:sz="1"/>
               <w:left w:val="single" w:color="CCCCCC" w:sz="1"/>
@@ -2216,7 +2330,7 @@
         </w:tc>
         <w:tc>
           <w:tcPr>
-            <w:tcW w:type="dxa" w:w="1100"/>
+            <w:tcW w:type="dxa" w:w="800"/>
             <w:tcBorders>
               <w:top w:val="single" w:color="CCCCCC" w:sz="1"/>
               <w:left w:val="single" w:color="CCCCCC" w:sz="1"/>
@@ -2239,6 +2353,576 @@
                 <w:szCs w:val="20"/>
               </w:rPr>
               <w:t xml:space="preserve">S-09</w:t>
+            </w:r>
+          </w:p>
+        </w:tc>
+      </w:tr>
+      <w:tr>
+        <w:tc>
+          <w:tcPr>
+            <w:tcW w:type="dxa" w:w="2200"/>
+            <w:tcBorders>
+              <w:top w:val="single" w:color="CCCCCC" w:sz="1"/>
+              <w:left w:val="single" w:color="CCCCCC" w:sz="1"/>
+              <w:bottom w:val="single" w:color="CCCCCC" w:sz="1"/>
+              <w:right w:val="single" w:color="CCCCCC" w:sz="1"/>
+            </w:tcBorders>
+            <w:shd w:fill="FFFFFF" w:val="clear"/>
+            <w:tcMar>
+              <w:top w:type="dxa" w:w="80"/>
+              <w:left w:type="dxa" w:w="120"/>
+              <w:bottom w:type="dxa" w:w="80"/>
+              <w:right w:type="dxa" w:w="120"/>
+            </w:tcMar>
+          </w:tcPr>
+          <w:p>
+            <w:r>
+              <w:rPr>
+                <w:rFonts w:ascii="Arial" w:cs="Arial" w:eastAsia="Arial" w:hAnsi="Arial"/>
+                <w:sz w:val="20"/>
+                <w:szCs w:val="20"/>
+              </w:rPr>
+              <w:t xml:space="preserve">Exe launches itself recursively</w:t>
+            </w:r>
+          </w:p>
+        </w:tc>
+        <w:tc>
+          <w:tcPr>
+            <w:tcW w:type="dxa" w:w="2800"/>
+            <w:tcBorders>
+              <w:top w:val="single" w:color="CCCCCC" w:sz="1"/>
+              <w:left w:val="single" w:color="CCCCCC" w:sz="1"/>
+              <w:bottom w:val="single" w:color="CCCCCC" w:sz="1"/>
+              <w:right w:val="single" w:color="CCCCCC" w:sz="1"/>
+            </w:tcBorders>
+            <w:shd w:fill="FFFFFF" w:val="clear"/>
+            <w:tcMar>
+              <w:top w:type="dxa" w:w="80"/>
+              <w:left w:type="dxa" w:w="120"/>
+              <w:bottom w:type="dxa" w:w="80"/>
+              <w:right w:type="dxa" w:w="120"/>
+            </w:tcMar>
+          </w:tcPr>
+          <w:p>
+            <w:r>
+              <w:rPr>
+                <w:rFonts w:ascii="Arial" w:cs="Arial" w:eastAsia="Arial" w:hAnsi="Arial"/>
+                <w:sz w:val="20"/>
+                <w:szCs w:val="20"/>
+              </w:rPr>
+              <w:t xml:space="preserve">sys.executable inside frozen onefile IS the exe</w:t>
+            </w:r>
+          </w:p>
+        </w:tc>
+        <w:tc>
+          <w:tcPr>
+            <w:tcW w:type="dxa" w:w="2760"/>
+            <w:tcBorders>
+              <w:top w:val="single" w:color="CCCCCC" w:sz="1"/>
+              <w:left w:val="single" w:color="CCCCCC" w:sz="1"/>
+              <w:bottom w:val="single" w:color="CCCCCC" w:sz="1"/>
+              <w:right w:val="single" w:color="CCCCCC" w:sz="1"/>
+            </w:tcBorders>
+            <w:shd w:fill="FFFFFF" w:val="clear"/>
+            <w:tcMar>
+              <w:top w:type="dxa" w:w="80"/>
+              <w:left w:type="dxa" w:w="120"/>
+              <w:bottom w:type="dxa" w:w="80"/>
+              <w:right w:type="dxa" w:w="120"/>
+            </w:tcMar>
+          </w:tcPr>
+          <w:p>
+            <w:r>
+              <w:rPr>
+                <w:rFonts w:ascii="Arial" w:cs="Arial" w:eastAsia="Arial" w:hAnsi="Arial"/>
+                <w:sz w:val="20"/>
+                <w:szCs w:val="20"/>
+              </w:rPr>
+              <w:t xml:space="preserve">Replaced subprocess with streamlit.web.bootstrap.run() in-process</w:t>
+            </w:r>
+          </w:p>
+        </w:tc>
+        <w:tc>
+          <w:tcPr>
+            <w:tcW w:type="dxa" w:w="800"/>
+            <w:tcBorders>
+              <w:top w:val="single" w:color="CCCCCC" w:sz="1"/>
+              <w:left w:val="single" w:color="CCCCCC" w:sz="1"/>
+              <w:bottom w:val="single" w:color="CCCCCC" w:sz="1"/>
+              <w:right w:val="single" w:color="CCCCCC" w:sz="1"/>
+            </w:tcBorders>
+            <w:shd w:fill="FFFFFF" w:val="clear"/>
+            <w:tcMar>
+              <w:top w:type="dxa" w:w="80"/>
+              <w:left w:type="dxa" w:w="120"/>
+              <w:bottom w:type="dxa" w:w="80"/>
+              <w:right w:type="dxa" w:w="120"/>
+            </w:tcMar>
+          </w:tcPr>
+          <w:p>
+            <w:r>
+              <w:rPr>
+                <w:rFonts w:ascii="Arial" w:cs="Arial" w:eastAsia="Arial" w:hAnsi="Arial"/>
+                <w:sz w:val="20"/>
+                <w:szCs w:val="20"/>
+              </w:rPr>
+              <w:t xml:space="preserve">S-10</w:t>
+            </w:r>
+          </w:p>
+        </w:tc>
+      </w:tr>
+      <w:tr>
+        <w:tc>
+          <w:tcPr>
+            <w:tcW w:type="dxa" w:w="2200"/>
+            <w:tcBorders>
+              <w:top w:val="single" w:color="CCCCCC" w:sz="1"/>
+              <w:left w:val="single" w:color="CCCCCC" w:sz="1"/>
+              <w:bottom w:val="single" w:color="CCCCCC" w:sz="1"/>
+              <w:right w:val="single" w:color="CCCCCC" w:sz="1"/>
+            </w:tcBorders>
+            <w:shd w:fill="F2F2F2" w:val="clear"/>
+            <w:tcMar>
+              <w:top w:type="dxa" w:w="80"/>
+              <w:left w:type="dxa" w:w="120"/>
+              <w:bottom w:type="dxa" w:w="80"/>
+              <w:right w:type="dxa" w:w="120"/>
+            </w:tcMar>
+          </w:tcPr>
+          <w:p>
+            <w:r>
+              <w:rPr>
+                <w:rFonts w:ascii="Arial" w:cs="Arial" w:eastAsia="Arial" w:hAnsi="Arial"/>
+                <w:sz w:val="20"/>
+                <w:szCs w:val="20"/>
+              </w:rPr>
+              <w:t xml:space="preserve">signal only works in main thread</w:t>
+            </w:r>
+          </w:p>
+        </w:tc>
+        <w:tc>
+          <w:tcPr>
+            <w:tcW w:type="dxa" w:w="2800"/>
+            <w:tcBorders>
+              <w:top w:val="single" w:color="CCCCCC" w:sz="1"/>
+              <w:left w:val="single" w:color="CCCCCC" w:sz="1"/>
+              <w:bottom w:val="single" w:color="CCCCCC" w:sz="1"/>
+              <w:right w:val="single" w:color="CCCCCC" w:sz="1"/>
+            </w:tcBorders>
+            <w:shd w:fill="F2F2F2" w:val="clear"/>
+            <w:tcMar>
+              <w:top w:type="dxa" w:w="80"/>
+              <w:left w:type="dxa" w:w="120"/>
+              <w:bottom w:type="dxa" w:w="80"/>
+              <w:right w:type="dxa" w:w="120"/>
+            </w:tcMar>
+          </w:tcPr>
+          <w:p>
+            <w:r>
+              <w:rPr>
+                <w:rFonts w:ascii="Arial" w:cs="Arial" w:eastAsia="Arial" w:hAnsi="Arial"/>
+                <w:sz w:val="20"/>
+                <w:szCs w:val="20"/>
+              </w:rPr>
+              <w:t xml:space="preserve">Streamlit sets SIGTERM handler which fails on daemon threads</w:t>
+            </w:r>
+          </w:p>
+        </w:tc>
+        <w:tc>
+          <w:tcPr>
+            <w:tcW w:type="dxa" w:w="2760"/>
+            <w:tcBorders>
+              <w:top w:val="single" w:color="CCCCCC" w:sz="1"/>
+              <w:left w:val="single" w:color="CCCCCC" w:sz="1"/>
+              <w:bottom w:val="single" w:color="CCCCCC" w:sz="1"/>
+              <w:right w:val="single" w:color="CCCCCC" w:sz="1"/>
+            </w:tcBorders>
+            <w:shd w:fill="F2F2F2" w:val="clear"/>
+            <w:tcMar>
+              <w:top w:type="dxa" w:w="80"/>
+              <w:left w:type="dxa" w:w="120"/>
+              <w:bottom w:type="dxa" w:w="80"/>
+              <w:right w:type="dxa" w:w="120"/>
+            </w:tcMar>
+          </w:tcPr>
+          <w:p>
+            <w:r>
+              <w:rPr>
+                <w:rFonts w:ascii="Arial" w:cs="Arial" w:eastAsia="Arial" w:hAnsi="Arial"/>
+                <w:sz w:val="20"/>
+                <w:szCs w:val="20"/>
+              </w:rPr>
+              <w:t xml:space="preserve">signal.signal() globally patched with try/except wrapper</w:t>
+            </w:r>
+          </w:p>
+        </w:tc>
+        <w:tc>
+          <w:tcPr>
+            <w:tcW w:type="dxa" w:w="800"/>
+            <w:tcBorders>
+              <w:top w:val="single" w:color="CCCCCC" w:sz="1"/>
+              <w:left w:val="single" w:color="CCCCCC" w:sz="1"/>
+              <w:bottom w:val="single" w:color="CCCCCC" w:sz="1"/>
+              <w:right w:val="single" w:color="CCCCCC" w:sz="1"/>
+            </w:tcBorders>
+            <w:shd w:fill="F2F2F2" w:val="clear"/>
+            <w:tcMar>
+              <w:top w:type="dxa" w:w="80"/>
+              <w:left w:type="dxa" w:w="120"/>
+              <w:bottom w:type="dxa" w:w="80"/>
+              <w:right w:type="dxa" w:w="120"/>
+            </w:tcMar>
+          </w:tcPr>
+          <w:p>
+            <w:r>
+              <w:rPr>
+                <w:rFonts w:ascii="Arial" w:cs="Arial" w:eastAsia="Arial" w:hAnsi="Arial"/>
+                <w:sz w:val="20"/>
+                <w:szCs w:val="20"/>
+              </w:rPr>
+              <w:t xml:space="preserve">S-10</w:t>
+            </w:r>
+          </w:p>
+        </w:tc>
+      </w:tr>
+      <w:tr>
+        <w:tc>
+          <w:tcPr>
+            <w:tcW w:type="dxa" w:w="2200"/>
+            <w:tcBorders>
+              <w:top w:val="single" w:color="CCCCCC" w:sz="1"/>
+              <w:left w:val="single" w:color="CCCCCC" w:sz="1"/>
+              <w:bottom w:val="single" w:color="CCCCCC" w:sz="1"/>
+              <w:right w:val="single" w:color="CCCCCC" w:sz="1"/>
+            </w:tcBorders>
+            <w:shd w:fill="FFFFFF" w:val="clear"/>
+            <w:tcMar>
+              <w:top w:type="dxa" w:w="80"/>
+              <w:left w:type="dxa" w:w="120"/>
+              <w:bottom w:type="dxa" w:w="80"/>
+              <w:right w:type="dxa" w:w="120"/>
+            </w:tcMar>
+          </w:tcPr>
+          <w:p>
+            <w:r>
+              <w:rPr>
+                <w:rFonts w:ascii="Arial" w:cs="Arial" w:eastAsia="Arial" w:hAnsi="Arial"/>
+                <w:sz w:val="20"/>
+                <w:szCs w:val="20"/>
+              </w:rPr>
+              <w:t xml:space="preserve">Server on port 3000 not 8501</w:t>
+            </w:r>
+          </w:p>
+        </w:tc>
+        <w:tc>
+          <w:tcPr>
+            <w:tcW w:type="dxa" w:w="2800"/>
+            <w:tcBorders>
+              <w:top w:val="single" w:color="CCCCCC" w:sz="1"/>
+              <w:left w:val="single" w:color="CCCCCC" w:sz="1"/>
+              <w:bottom w:val="single" w:color="CCCCCC" w:sz="1"/>
+              <w:right w:val="single" w:color="CCCCCC" w:sz="1"/>
+            </w:tcBorders>
+            <w:shd w:fill="FFFFFF" w:val="clear"/>
+            <w:tcMar>
+              <w:top w:type="dxa" w:w="80"/>
+              <w:left w:type="dxa" w:w="120"/>
+              <w:bottom w:type="dxa" w:w="80"/>
+              <w:right w:type="dxa" w:w="120"/>
+            </w:tcMar>
+          </w:tcPr>
+          <w:p>
+            <w:r>
+              <w:rPr>
+                <w:rFonts w:ascii="Arial" w:cs="Arial" w:eastAsia="Arial" w:hAnsi="Arial"/>
+                <w:sz w:val="20"/>
+                <w:szCs w:val="20"/>
+              </w:rPr>
+              <w:t xml:space="preserve">global.developmentMode defaulting to true inside frozen bundle</w:t>
+            </w:r>
+          </w:p>
+        </w:tc>
+        <w:tc>
+          <w:tcPr>
+            <w:tcW w:type="dxa" w:w="2760"/>
+            <w:tcBorders>
+              <w:top w:val="single" w:color="CCCCCC" w:sz="1"/>
+              <w:left w:val="single" w:color="CCCCCC" w:sz="1"/>
+              <w:bottom w:val="single" w:color="CCCCCC" w:sz="1"/>
+              <w:right w:val="single" w:color="CCCCCC" w:sz="1"/>
+            </w:tcBorders>
+            <w:shd w:fill="FFFFFF" w:val="clear"/>
+            <w:tcMar>
+              <w:top w:type="dxa" w:w="80"/>
+              <w:left w:type="dxa" w:w="120"/>
+              <w:bottom w:type="dxa" w:w="80"/>
+              <w:right w:type="dxa" w:w="120"/>
+            </w:tcMar>
+          </w:tcPr>
+          <w:p>
+            <w:r>
+              <w:rPr>
+                <w:rFonts w:ascii="Arial" w:cs="Arial" w:eastAsia="Arial" w:hAnsi="Arial"/>
+                <w:sz w:val="20"/>
+                <w:szCs w:val="20"/>
+              </w:rPr>
+              <w:t xml:space="preserve">set_option('global.developmentMode', False) called post-import</w:t>
+            </w:r>
+          </w:p>
+        </w:tc>
+        <w:tc>
+          <w:tcPr>
+            <w:tcW w:type="dxa" w:w="800"/>
+            <w:tcBorders>
+              <w:top w:val="single" w:color="CCCCCC" w:sz="1"/>
+              <w:left w:val="single" w:color="CCCCCC" w:sz="1"/>
+              <w:bottom w:val="single" w:color="CCCCCC" w:sz="1"/>
+              <w:right w:val="single" w:color="CCCCCC" w:sz="1"/>
+            </w:tcBorders>
+            <w:shd w:fill="FFFFFF" w:val="clear"/>
+            <w:tcMar>
+              <w:top w:type="dxa" w:w="80"/>
+              <w:left w:type="dxa" w:w="120"/>
+              <w:bottom w:type="dxa" w:w="80"/>
+              <w:right w:type="dxa" w:w="120"/>
+            </w:tcMar>
+          </w:tcPr>
+          <w:p>
+            <w:r>
+              <w:rPr>
+                <w:rFonts w:ascii="Arial" w:cs="Arial" w:eastAsia="Arial" w:hAnsi="Arial"/>
+                <w:sz w:val="20"/>
+                <w:szCs w:val="20"/>
+              </w:rPr>
+              <w:t xml:space="preserve">S-10</w:t>
+            </w:r>
+          </w:p>
+        </w:tc>
+      </w:tr>
+      <w:tr>
+        <w:tc>
+          <w:tcPr>
+            <w:tcW w:type="dxa" w:w="2200"/>
+            <w:tcBorders>
+              <w:top w:val="single" w:color="CCCCCC" w:sz="1"/>
+              <w:left w:val="single" w:color="CCCCCC" w:sz="1"/>
+              <w:bottom w:val="single" w:color="CCCCCC" w:sz="1"/>
+              <w:right w:val="single" w:color="CCCCCC" w:sz="1"/>
+            </w:tcBorders>
+            <w:shd w:fill="F2F2F2" w:val="clear"/>
+            <w:tcMar>
+              <w:top w:type="dxa" w:w="80"/>
+              <w:left w:type="dxa" w:w="120"/>
+              <w:bottom w:type="dxa" w:w="80"/>
+              <w:right w:type="dxa" w:w="120"/>
+            </w:tcMar>
+          </w:tcPr>
+          <w:p>
+            <w:r>
+              <w:rPr>
+                <w:rFonts w:ascii="Arial" w:cs="Arial" w:eastAsia="Arial" w:hAnsi="Arial"/>
+                <w:sz w:val="20"/>
+                <w:szCs w:val="20"/>
+              </w:rPr>
+              <w:t xml:space="preserve">SessionInfo not initialized / is_hello TypeError</w:t>
+            </w:r>
+          </w:p>
+        </w:tc>
+        <w:tc>
+          <w:tcPr>
+            <w:tcW w:type="dxa" w:w="2800"/>
+            <w:tcBorders>
+              <w:top w:val="single" w:color="CCCCCC" w:sz="1"/>
+              <w:left w:val="single" w:color="CCCCCC" w:sz="1"/>
+              <w:bottom w:val="single" w:color="CCCCCC" w:sz="1"/>
+              <w:right w:val="single" w:color="CCCCCC" w:sz="1"/>
+            </w:tcBorders>
+            <w:shd w:fill="F2F2F2" w:val="clear"/>
+            <w:tcMar>
+              <w:top w:type="dxa" w:w="80"/>
+              <w:left w:type="dxa" w:w="120"/>
+              <w:bottom w:type="dxa" w:w="80"/>
+              <w:right w:type="dxa" w:w="120"/>
+            </w:tcMar>
+          </w:tcPr>
+          <w:p>
+            <w:r>
+              <w:rPr>
+                <w:rFonts w:ascii="Arial" w:cs="Arial" w:eastAsia="Arial" w:hAnsi="Arial"/>
+                <w:sz w:val="20"/>
+                <w:szCs w:val="20"/>
+              </w:rPr>
+              <w:t xml:space="preserve">bootstrap.run() called with empty string '' for command_line arg</w:t>
+            </w:r>
+          </w:p>
+        </w:tc>
+        <w:tc>
+          <w:tcPr>
+            <w:tcW w:type="dxa" w:w="2760"/>
+            <w:tcBorders>
+              <w:top w:val="single" w:color="CCCCCC" w:sz="1"/>
+              <w:left w:val="single" w:color="CCCCCC" w:sz="1"/>
+              <w:bottom w:val="single" w:color="CCCCCC" w:sz="1"/>
+              <w:right w:val="single" w:color="CCCCCC" w:sz="1"/>
+            </w:tcBorders>
+            <w:shd w:fill="F2F2F2" w:val="clear"/>
+            <w:tcMar>
+              <w:top w:type="dxa" w:w="80"/>
+              <w:left w:type="dxa" w:w="120"/>
+              <w:bottom w:type="dxa" w:w="80"/>
+              <w:right w:type="dxa" w:w="120"/>
+            </w:tcMar>
+          </w:tcPr>
+          <w:p>
+            <w:r>
+              <w:rPr>
+                <w:rFonts w:ascii="Arial" w:cs="Arial" w:eastAsia="Arial" w:hAnsi="Arial"/>
+                <w:sz w:val="20"/>
+                <w:szCs w:val="20"/>
+              </w:rPr>
+              <w:t xml:space="preserve">Changed to False (bool) — correct type for protobuf bool field</w:t>
+            </w:r>
+          </w:p>
+        </w:tc>
+        <w:tc>
+          <w:tcPr>
+            <w:tcW w:type="dxa" w:w="800"/>
+            <w:tcBorders>
+              <w:top w:val="single" w:color="CCCCCC" w:sz="1"/>
+              <w:left w:val="single" w:color="CCCCCC" w:sz="1"/>
+              <w:bottom w:val="single" w:color="CCCCCC" w:sz="1"/>
+              <w:right w:val="single" w:color="CCCCCC" w:sz="1"/>
+            </w:tcBorders>
+            <w:shd w:fill="F2F2F2" w:val="clear"/>
+            <w:tcMar>
+              <w:top w:type="dxa" w:w="80"/>
+              <w:left w:type="dxa" w:w="120"/>
+              <w:bottom w:type="dxa" w:w="80"/>
+              <w:right w:type="dxa" w:w="120"/>
+            </w:tcMar>
+          </w:tcPr>
+          <w:p>
+            <w:r>
+              <w:rPr>
+                <w:rFonts w:ascii="Arial" w:cs="Arial" w:eastAsia="Arial" w:hAnsi="Arial"/>
+                <w:sz w:val="20"/>
+                <w:szCs w:val="20"/>
+              </w:rPr>
+              <w:t xml:space="preserve">S-10</w:t>
+            </w:r>
+          </w:p>
+        </w:tc>
+      </w:tr>
+      <w:tr>
+        <w:tc>
+          <w:tcPr>
+            <w:tcW w:type="dxa" w:w="2200"/>
+            <w:tcBorders>
+              <w:top w:val="single" w:color="CCCCCC" w:sz="1"/>
+              <w:left w:val="single" w:color="CCCCCC" w:sz="1"/>
+              <w:bottom w:val="single" w:color="CCCCCC" w:sz="1"/>
+              <w:right w:val="single" w:color="CCCCCC" w:sz="1"/>
+            </w:tcBorders>
+            <w:shd w:fill="FFFFFF" w:val="clear"/>
+            <w:tcMar>
+              <w:top w:type="dxa" w:w="80"/>
+              <w:left w:type="dxa" w:w="120"/>
+              <w:bottom w:type="dxa" w:w="80"/>
+              <w:right w:type="dxa" w:w="120"/>
+            </w:tcMar>
+          </w:tcPr>
+          <w:p>
+            <w:r>
+              <w:rPr>
+                <w:rFonts w:ascii="Arial" w:cs="Arial" w:eastAsia="Arial" w:hAnsi="Arial"/>
+                <w:sz w:val="20"/>
+                <w:szCs w:val="20"/>
+              </w:rPr>
+              <w:t xml:space="preserve">protobuf type errors on Python 3.11</w:t>
+            </w:r>
+          </w:p>
+        </w:tc>
+        <w:tc>
+          <w:tcPr>
+            <w:tcW w:type="dxa" w:w="2800"/>
+            <w:tcBorders>
+              <w:top w:val="single" w:color="CCCCCC" w:sz="1"/>
+              <w:left w:val="single" w:color="CCCCCC" w:sz="1"/>
+              <w:bottom w:val="single" w:color="CCCCCC" w:sz="1"/>
+              <w:right w:val="single" w:color="CCCCCC" w:sz="1"/>
+            </w:tcBorders>
+            <w:shd w:fill="FFFFFF" w:val="clear"/>
+            <w:tcMar>
+              <w:top w:type="dxa" w:w="80"/>
+              <w:left w:type="dxa" w:w="120"/>
+              <w:bottom w:type="dxa" w:w="80"/>
+              <w:right w:type="dxa" w:w="120"/>
+            </w:tcMar>
+          </w:tcPr>
+          <w:p>
+            <w:r>
+              <w:rPr>
+                <w:rFonts w:ascii="Arial" w:cs="Arial" w:eastAsia="Arial" w:hAnsi="Arial"/>
+                <w:sz w:val="20"/>
+                <w:szCs w:val="20"/>
+              </w:rPr>
+              <w:t xml:space="preserve">protobuf 4.x changed bool field handling; Streamlit 1.35 written for 3.x</w:t>
+            </w:r>
+          </w:p>
+        </w:tc>
+        <w:tc>
+          <w:tcPr>
+            <w:tcW w:type="dxa" w:w="2760"/>
+            <w:tcBorders>
+              <w:top w:val="single" w:color="CCCCCC" w:sz="1"/>
+              <w:left w:val="single" w:color="CCCCCC" w:sz="1"/>
+              <w:bottom w:val="single" w:color="CCCCCC" w:sz="1"/>
+              <w:right w:val="single" w:color="CCCCCC" w:sz="1"/>
+            </w:tcBorders>
+            <w:shd w:fill="FFFFFF" w:val="clear"/>
+            <w:tcMar>
+              <w:top w:type="dxa" w:w="80"/>
+              <w:left w:type="dxa" w:w="120"/>
+              <w:bottom w:type="dxa" w:w="80"/>
+              <w:right w:type="dxa" w:w="120"/>
+            </w:tcMar>
+          </w:tcPr>
+          <w:p>
+            <w:r>
+              <w:rPr>
+                <w:rFonts w:ascii="Arial" w:cs="Arial" w:eastAsia="Arial" w:hAnsi="Arial"/>
+                <w:sz w:val="20"/>
+                <w:szCs w:val="20"/>
+              </w:rPr>
+              <w:t xml:space="preserve">Pinned protobuf==3.20.3 in requirements.txt</w:t>
+            </w:r>
+          </w:p>
+        </w:tc>
+        <w:tc>
+          <w:tcPr>
+            <w:tcW w:type="dxa" w:w="800"/>
+            <w:tcBorders>
+              <w:top w:val="single" w:color="CCCCCC" w:sz="1"/>
+              <w:left w:val="single" w:color="CCCCCC" w:sz="1"/>
+              <w:bottom w:val="single" w:color="CCCCCC" w:sz="1"/>
+              <w:right w:val="single" w:color="CCCCCC" w:sz="1"/>
+            </w:tcBorders>
+            <w:shd w:fill="FFFFFF" w:val="clear"/>
+            <w:tcMar>
+              <w:top w:type="dxa" w:w="80"/>
+              <w:left w:type="dxa" w:w="120"/>
+              <w:bottom w:type="dxa" w:w="80"/>
+              <w:right w:type="dxa" w:w="120"/>
+            </w:tcMar>
+          </w:tcPr>
+          <w:p>
+            <w:r>
+              <w:rPr>
+                <w:rFonts w:ascii="Arial" w:cs="Arial" w:eastAsia="Arial" w:hAnsi="Arial"/>
+                <w:sz w:val="20"/>
+                <w:szCs w:val="20"/>
+              </w:rPr>
+              <w:t xml:space="preserve">S-10</w:t>
             </w:r>
           </w:p>
         </w:tc>
@@ -2448,6 +3132,46 @@
     </w:p>
     <w:p>
       <w:pPr>
+        <w:pStyle w:val="ListParagraph"/>
+        <w:numPr>
+          <w:ilvl w:val="0"/>
+          <w:numId w:val="2"/>
+        </w:numPr>
+        <w:spacing w:before="40" w:after="40"/>
+      </w:pPr>
+      <w:r>
+        <w:rPr>
+          <w:rFonts w:ascii="Arial" w:cs="Arial" w:eastAsia="Arial" w:hAnsi="Arial"/>
+          <w:b w:val="false"/>
+          <w:bCs w:val="false"/>
+          <w:sz w:val="22"/>
+          <w:szCs w:val="22"/>
+        </w:rPr>
+        <w:t xml:space="preserve">Windows standalone executable (no Python required on end-user machine)</w:t>
+      </w:r>
+    </w:p>
+    <w:p>
+      <w:pPr>
+        <w:pStyle w:val="ListParagraph"/>
+        <w:numPr>
+          <w:ilvl w:val="0"/>
+          <w:numId w:val="2"/>
+        </w:numPr>
+        <w:spacing w:before="40" w:after="40"/>
+      </w:pPr>
+      <w:r>
+        <w:rPr>
+          <w:rFonts w:ascii="Arial" w:cs="Arial" w:eastAsia="Arial" w:hAnsi="Arial"/>
+          <w:b w:val="false"/>
+          <w:bCs w:val="false"/>
+          <w:sz w:val="22"/>
+          <w:szCs w:val="22"/>
+        </w:rPr>
+        <w:t xml:space="preserve">IT certificate guide for enterprise deployment</w:t>
+      </w:r>
+    </w:p>
+    <w:p>
+      <w:pPr>
         <w:pStyle w:val="Heading2"/>
         <w:spacing w:before="240" w:after="80"/>
       </w:pPr>
@@ -2545,6 +3269,26 @@
     </w:p>
     <w:p>
       <w:pPr>
+        <w:pStyle w:val="ListParagraph"/>
+        <w:numPr>
+          <w:ilvl w:val="0"/>
+          <w:numId w:val="2"/>
+        </w:numPr>
+        <w:spacing w:before="40" w:after="40"/>
+      </w:pPr>
+      <w:r>
+        <w:rPr>
+          <w:rFonts w:ascii="Arial" w:cs="Arial" w:eastAsia="Arial" w:hAnsi="Arial"/>
+          <w:b w:val="false"/>
+          <w:bCs w:val="false"/>
+          <w:sz w:val="22"/>
+          <w:szCs w:val="22"/>
+        </w:rPr>
+        <w:t xml:space="preserve">Auto-update mechanism for the exe</w:t>
+      </w:r>
+    </w:p>
+    <w:p>
+      <w:pPr>
         <w:pBdr>
           <w:bottom w:val="single" w:color="2E74B5" w:sz="6" w:space="1"/>
         </w:pBdr>
@@ -2764,7 +3508,7 @@
                 <w:sz w:val="20"/>
                 <w:szCs w:val="20"/>
               </w:rPr>
-              <w:t xml:space="preserve">DITA 2.0 · Multi-topic · .ditamap · Selective export · Image support</w:t>
+              <w:t xml:space="preserve">DITA 2.0 · Multi-topic · .ditamap · Selective export · Image support · Windows exe</w:t>
             </w:r>
           </w:p>
         </w:tc>
@@ -3152,10 +3896,10 @@
         </w:tblBorders>
       </w:tblPr>
       <w:tblGrid>
-        <w:gridCol w:w="2800"/>
-        <w:gridCol w:w="1400"/>
-        <w:gridCol w:w="1400"/>
-        <w:gridCol w:w="3760"/>
+        <w:gridCol w:w="2500"/>
+        <w:gridCol w:w="1300"/>
+        <w:gridCol w:w="1300"/>
+        <w:gridCol w:w="4260"/>
       </w:tblGrid>
       <w:tr>
         <w:trPr>
@@ -3163,7 +3907,7 @@
         </w:trPr>
         <w:tc>
           <w:tcPr>
-            <w:tcW w:type="dxa" w:w="2800"/>
+            <w:tcW w:type="dxa" w:w="2500"/>
             <w:tcBorders>
               <w:top w:val="single" w:color="CCCCCC" w:sz="1"/>
               <w:left w:val="single" w:color="CCCCCC" w:sz="1"/>
@@ -3194,7 +3938,7 @@
         </w:tc>
         <w:tc>
           <w:tcPr>
-            <w:tcW w:type="dxa" w:w="1400"/>
+            <w:tcW w:type="dxa" w:w="1300"/>
             <w:tcBorders>
               <w:top w:val="single" w:color="CCCCCC" w:sz="1"/>
               <w:left w:val="single" w:color="CCCCCC" w:sz="1"/>
@@ -3225,7 +3969,7 @@
         </w:tc>
         <w:tc>
           <w:tcPr>
-            <w:tcW w:type="dxa" w:w="1400"/>
+            <w:tcW w:type="dxa" w:w="1300"/>
             <w:tcBorders>
               <w:top w:val="single" w:color="CCCCCC" w:sz="1"/>
               <w:left w:val="single" w:color="CCCCCC" w:sz="1"/>
@@ -3256,7 +4000,7 @@
         </w:tc>
         <w:tc>
           <w:tcPr>
-            <w:tcW w:type="dxa" w:w="3760"/>
+            <w:tcW w:type="dxa" w:w="4260"/>
             <w:tcBorders>
               <w:top w:val="single" w:color="CCCCCC" w:sz="1"/>
               <w:left w:val="single" w:color="CCCCCC" w:sz="1"/>
@@ -3289,7 +4033,7 @@
       <w:tr>
         <w:tc>
           <w:tcPr>
-            <w:tcW w:type="dxa" w:w="2800"/>
+            <w:tcW w:type="dxa" w:w="2500"/>
             <w:tcBorders>
               <w:top w:val="single" w:color="CCCCCC" w:sz="1"/>
               <w:left w:val="single" w:color="CCCCCC" w:sz="1"/>
@@ -3317,7 +4061,7 @@
         </w:tc>
         <w:tc>
           <w:tcPr>
-            <w:tcW w:type="dxa" w:w="1400"/>
+            <w:tcW w:type="dxa" w:w="1300"/>
             <w:tcBorders>
               <w:top w:val="single" w:color="CCCCCC" w:sz="1"/>
               <w:left w:val="single" w:color="CCCCCC" w:sz="1"/>
@@ -3345,7 +4089,7 @@
         </w:tc>
         <w:tc>
           <w:tcPr>
-            <w:tcW w:type="dxa" w:w="1400"/>
+            <w:tcW w:type="dxa" w:w="1300"/>
             <w:tcBorders>
               <w:top w:val="single" w:color="CCCCCC" w:sz="1"/>
               <w:left w:val="single" w:color="CCCCCC" w:sz="1"/>
@@ -3373,7 +4117,7 @@
         </w:tc>
         <w:tc>
           <w:tcPr>
-            <w:tcW w:type="dxa" w:w="3760"/>
+            <w:tcW w:type="dxa" w:w="4260"/>
             <w:tcBorders>
               <w:top w:val="single" w:color="CCCCCC" w:sz="1"/>
               <w:left w:val="single" w:color="CCCCCC" w:sz="1"/>
@@ -3403,7 +4147,7 @@
       <w:tr>
         <w:tc>
           <w:tcPr>
-            <w:tcW w:type="dxa" w:w="2800"/>
+            <w:tcW w:type="dxa" w:w="2500"/>
             <w:tcBorders>
               <w:top w:val="single" w:color="CCCCCC" w:sz="1"/>
               <w:left w:val="single" w:color="CCCCCC" w:sz="1"/>
@@ -3431,7 +4175,7 @@
         </w:tc>
         <w:tc>
           <w:tcPr>
-            <w:tcW w:type="dxa" w:w="1400"/>
+            <w:tcW w:type="dxa" w:w="1300"/>
             <w:tcBorders>
               <w:top w:val="single" w:color="CCCCCC" w:sz="1"/>
               <w:left w:val="single" w:color="CCCCCC" w:sz="1"/>
@@ -3459,7 +4203,7 @@
         </w:tc>
         <w:tc>
           <w:tcPr>
-            <w:tcW w:type="dxa" w:w="1400"/>
+            <w:tcW w:type="dxa" w:w="1300"/>
             <w:tcBorders>
               <w:top w:val="single" w:color="CCCCCC" w:sz="1"/>
               <w:left w:val="single" w:color="CCCCCC" w:sz="1"/>
@@ -3487,7 +4231,7 @@
         </w:tc>
         <w:tc>
           <w:tcPr>
-            <w:tcW w:type="dxa" w:w="3760"/>
+            <w:tcW w:type="dxa" w:w="4260"/>
             <w:tcBorders>
               <w:top w:val="single" w:color="CCCCCC" w:sz="1"/>
               <w:left w:val="single" w:color="CCCCCC" w:sz="1"/>
@@ -3517,7 +4261,7 @@
       <w:tr>
         <w:tc>
           <w:tcPr>
-            <w:tcW w:type="dxa" w:w="2800"/>
+            <w:tcW w:type="dxa" w:w="2500"/>
             <w:tcBorders>
               <w:top w:val="single" w:color="CCCCCC" w:sz="1"/>
               <w:left w:val="single" w:color="CCCCCC" w:sz="1"/>
@@ -3545,7 +4289,7 @@
         </w:tc>
         <w:tc>
           <w:tcPr>
-            <w:tcW w:type="dxa" w:w="1400"/>
+            <w:tcW w:type="dxa" w:w="1300"/>
             <w:tcBorders>
               <w:top w:val="single" w:color="CCCCCC" w:sz="1"/>
               <w:left w:val="single" w:color="CCCCCC" w:sz="1"/>
@@ -3573,7 +4317,7 @@
         </w:tc>
         <w:tc>
           <w:tcPr>
-            <w:tcW w:type="dxa" w:w="1400"/>
+            <w:tcW w:type="dxa" w:w="1300"/>
             <w:tcBorders>
               <w:top w:val="single" w:color="CCCCCC" w:sz="1"/>
               <w:left w:val="single" w:color="CCCCCC" w:sz="1"/>
@@ -3601,7 +4345,7 @@
         </w:tc>
         <w:tc>
           <w:tcPr>
-            <w:tcW w:type="dxa" w:w="3760"/>
+            <w:tcW w:type="dxa" w:w="4260"/>
             <w:tcBorders>
               <w:top w:val="single" w:color="CCCCCC" w:sz="1"/>
               <w:left w:val="single" w:color="CCCCCC" w:sz="1"/>
@@ -3631,7 +4375,7 @@
       <w:tr>
         <w:tc>
           <w:tcPr>
-            <w:tcW w:type="dxa" w:w="2800"/>
+            <w:tcW w:type="dxa" w:w="2500"/>
             <w:tcBorders>
               <w:top w:val="single" w:color="CCCCCC" w:sz="1"/>
               <w:left w:val="single" w:color="CCCCCC" w:sz="1"/>
@@ -3659,7 +4403,7 @@
         </w:tc>
         <w:tc>
           <w:tcPr>
-            <w:tcW w:type="dxa" w:w="1400"/>
+            <w:tcW w:type="dxa" w:w="1300"/>
             <w:tcBorders>
               <w:top w:val="single" w:color="CCCCCC" w:sz="1"/>
               <w:left w:val="single" w:color="CCCCCC" w:sz="1"/>
@@ -3687,7 +4431,7 @@
         </w:tc>
         <w:tc>
           <w:tcPr>
-            <w:tcW w:type="dxa" w:w="1400"/>
+            <w:tcW w:type="dxa" w:w="1300"/>
             <w:tcBorders>
               <w:top w:val="single" w:color="CCCCCC" w:sz="1"/>
               <w:left w:val="single" w:color="CCCCCC" w:sz="1"/>
@@ -3715,7 +4459,7 @@
         </w:tc>
         <w:tc>
           <w:tcPr>
-            <w:tcW w:type="dxa" w:w="3760"/>
+            <w:tcW w:type="dxa" w:w="4260"/>
             <w:tcBorders>
               <w:top w:val="single" w:color="CCCCCC" w:sz="1"/>
               <w:left w:val="single" w:color="CCCCCC" w:sz="1"/>
@@ -3738,6 +4482,234 @@
                 <w:szCs w:val="20"/>
               </w:rPr>
               <w:t xml:space="preserve">Validator runs well-formedness check on every topic</w:t>
+            </w:r>
+          </w:p>
+        </w:tc>
+      </w:tr>
+      <w:tr>
+        <w:tc>
+          <w:tcPr>
+            <w:tcW w:type="dxa" w:w="2500"/>
+            <w:tcBorders>
+              <w:top w:val="single" w:color="CCCCCC" w:sz="1"/>
+              <w:left w:val="single" w:color="CCCCCC" w:sz="1"/>
+              <w:bottom w:val="single" w:color="CCCCCC" w:sz="1"/>
+              <w:right w:val="single" w:color="CCCCCC" w:sz="1"/>
+            </w:tcBorders>
+            <w:shd w:fill="F2F2F2" w:val="clear"/>
+            <w:tcMar>
+              <w:top w:type="dxa" w:w="80"/>
+              <w:left w:type="dxa" w:w="120"/>
+              <w:bottom w:type="dxa" w:w="80"/>
+              <w:right w:type="dxa" w:w="120"/>
+            </w:tcMar>
+          </w:tcPr>
+          <w:p>
+            <w:r>
+              <w:rPr>
+                <w:rFonts w:ascii="Arial" w:cs="Arial" w:eastAsia="Arial" w:hAnsi="Arial"/>
+                <w:sz w:val="20"/>
+                <w:szCs w:val="20"/>
+              </w:rPr>
+              <w:t xml:space="preserve">Windows Defender / SmartScreen blocks exe</w:t>
+            </w:r>
+          </w:p>
+        </w:tc>
+        <w:tc>
+          <w:tcPr>
+            <w:tcW w:type="dxa" w:w="1300"/>
+            <w:tcBorders>
+              <w:top w:val="single" w:color="CCCCCC" w:sz="1"/>
+              <w:left w:val="single" w:color="CCCCCC" w:sz="1"/>
+              <w:bottom w:val="single" w:color="CCCCCC" w:sz="1"/>
+              <w:right w:val="single" w:color="CCCCCC" w:sz="1"/>
+            </w:tcBorders>
+            <w:shd w:fill="F2F2F2" w:val="clear"/>
+            <w:tcMar>
+              <w:top w:type="dxa" w:w="80"/>
+              <w:left w:type="dxa" w:w="120"/>
+              <w:bottom w:type="dxa" w:w="80"/>
+              <w:right w:type="dxa" w:w="120"/>
+            </w:tcMar>
+          </w:tcPr>
+          <w:p>
+            <w:r>
+              <w:rPr>
+                <w:rFonts w:ascii="Arial" w:cs="Arial" w:eastAsia="Arial" w:hAnsi="Arial"/>
+                <w:sz w:val="20"/>
+                <w:szCs w:val="20"/>
+              </w:rPr>
+              <w:t xml:space="preserve">High (unsigned)</w:t>
+            </w:r>
+          </w:p>
+        </w:tc>
+        <w:tc>
+          <w:tcPr>
+            <w:tcW w:type="dxa" w:w="1300"/>
+            <w:tcBorders>
+              <w:top w:val="single" w:color="CCCCCC" w:sz="1"/>
+              <w:left w:val="single" w:color="CCCCCC" w:sz="1"/>
+              <w:bottom w:val="single" w:color="CCCCCC" w:sz="1"/>
+              <w:right w:val="single" w:color="CCCCCC" w:sz="1"/>
+            </w:tcBorders>
+            <w:shd w:fill="F2F2F2" w:val="clear"/>
+            <w:tcMar>
+              <w:top w:type="dxa" w:w="80"/>
+              <w:left w:type="dxa" w:w="120"/>
+              <w:bottom w:type="dxa" w:w="80"/>
+              <w:right w:type="dxa" w:w="120"/>
+            </w:tcMar>
+          </w:tcPr>
+          <w:p>
+            <w:r>
+              <w:rPr>
+                <w:rFonts w:ascii="Arial" w:cs="Arial" w:eastAsia="Arial" w:hAnsi="Arial"/>
+                <w:sz w:val="20"/>
+                <w:szCs w:val="20"/>
+              </w:rPr>
+              <w:t xml:space="preserve">Users cannot run tool</w:t>
+            </w:r>
+          </w:p>
+        </w:tc>
+        <w:tc>
+          <w:tcPr>
+            <w:tcW w:type="dxa" w:w="4260"/>
+            <w:tcBorders>
+              <w:top w:val="single" w:color="CCCCCC" w:sz="1"/>
+              <w:left w:val="single" w:color="CCCCCC" w:sz="1"/>
+              <w:bottom w:val="single" w:color="CCCCCC" w:sz="1"/>
+              <w:right w:val="single" w:color="CCCCCC" w:sz="1"/>
+            </w:tcBorders>
+            <w:shd w:fill="F2F2F2" w:val="clear"/>
+            <w:tcMar>
+              <w:top w:type="dxa" w:w="80"/>
+              <w:left w:type="dxa" w:w="120"/>
+              <w:bottom w:type="dxa" w:w="80"/>
+              <w:right w:type="dxa" w:w="120"/>
+            </w:tcMar>
+          </w:tcPr>
+          <w:p>
+            <w:r>
+              <w:rPr>
+                <w:rFonts w:ascii="Arial" w:cs="Arial" w:eastAsia="Arial" w:hAnsi="Arial"/>
+                <w:sz w:val="20"/>
+                <w:szCs w:val="20"/>
+              </w:rPr>
+              <w:t xml:space="preserve">IT cert guide provided; self-signed cert + GPO deployment</w:t>
+            </w:r>
+          </w:p>
+        </w:tc>
+      </w:tr>
+      <w:tr>
+        <w:tc>
+          <w:tcPr>
+            <w:tcW w:type="dxa" w:w="2500"/>
+            <w:tcBorders>
+              <w:top w:val="single" w:color="CCCCCC" w:sz="1"/>
+              <w:left w:val="single" w:color="CCCCCC" w:sz="1"/>
+              <w:bottom w:val="single" w:color="CCCCCC" w:sz="1"/>
+              <w:right w:val="single" w:color="CCCCCC" w:sz="1"/>
+            </w:tcBorders>
+            <w:shd w:fill="FFFFFF" w:val="clear"/>
+            <w:tcMar>
+              <w:top w:type="dxa" w:w="80"/>
+              <w:left w:type="dxa" w:w="120"/>
+              <w:bottom w:type="dxa" w:w="80"/>
+              <w:right w:type="dxa" w:w="120"/>
+            </w:tcMar>
+          </w:tcPr>
+          <w:p>
+            <w:r>
+              <w:rPr>
+                <w:rFonts w:ascii="Arial" w:cs="Arial" w:eastAsia="Arial" w:hAnsi="Arial"/>
+                <w:sz w:val="20"/>
+                <w:szCs w:val="20"/>
+              </w:rPr>
+              <w:t xml:space="preserve">protobuf version conflict on new installs</w:t>
+            </w:r>
+          </w:p>
+        </w:tc>
+        <w:tc>
+          <w:tcPr>
+            <w:tcW w:type="dxa" w:w="1300"/>
+            <w:tcBorders>
+              <w:top w:val="single" w:color="CCCCCC" w:sz="1"/>
+              <w:left w:val="single" w:color="CCCCCC" w:sz="1"/>
+              <w:bottom w:val="single" w:color="CCCCCC" w:sz="1"/>
+              <w:right w:val="single" w:color="CCCCCC" w:sz="1"/>
+            </w:tcBorders>
+            <w:shd w:fill="FFFFFF" w:val="clear"/>
+            <w:tcMar>
+              <w:top w:type="dxa" w:w="80"/>
+              <w:left w:type="dxa" w:w="120"/>
+              <w:bottom w:type="dxa" w:w="80"/>
+              <w:right w:type="dxa" w:w="120"/>
+            </w:tcMar>
+          </w:tcPr>
+          <w:p>
+            <w:r>
+              <w:rPr>
+                <w:rFonts w:ascii="Arial" w:cs="Arial" w:eastAsia="Arial" w:hAnsi="Arial"/>
+                <w:sz w:val="20"/>
+                <w:szCs w:val="20"/>
+              </w:rPr>
+              <w:t xml:space="preserve">Low</w:t>
+            </w:r>
+          </w:p>
+        </w:tc>
+        <w:tc>
+          <w:tcPr>
+            <w:tcW w:type="dxa" w:w="1300"/>
+            <w:tcBorders>
+              <w:top w:val="single" w:color="CCCCCC" w:sz="1"/>
+              <w:left w:val="single" w:color="CCCCCC" w:sz="1"/>
+              <w:bottom w:val="single" w:color="CCCCCC" w:sz="1"/>
+              <w:right w:val="single" w:color="CCCCCC" w:sz="1"/>
+            </w:tcBorders>
+            <w:shd w:fill="FFFFFF" w:val="clear"/>
+            <w:tcMar>
+              <w:top w:type="dxa" w:w="80"/>
+              <w:left w:type="dxa" w:w="120"/>
+              <w:bottom w:type="dxa" w:w="80"/>
+              <w:right w:type="dxa" w:w="120"/>
+            </w:tcMar>
+          </w:tcPr>
+          <w:p>
+            <w:r>
+              <w:rPr>
+                <w:rFonts w:ascii="Arial" w:cs="Arial" w:eastAsia="Arial" w:hAnsi="Arial"/>
+                <w:sz w:val="20"/>
+                <w:szCs w:val="20"/>
+              </w:rPr>
+              <w:t xml:space="preserve">Streamlit session errors</w:t>
+            </w:r>
+          </w:p>
+        </w:tc>
+        <w:tc>
+          <w:tcPr>
+            <w:tcW w:type="dxa" w:w="4260"/>
+            <w:tcBorders>
+              <w:top w:val="single" w:color="CCCCCC" w:sz="1"/>
+              <w:left w:val="single" w:color="CCCCCC" w:sz="1"/>
+              <w:bottom w:val="single" w:color="CCCCCC" w:sz="1"/>
+              <w:right w:val="single" w:color="CCCCCC" w:sz="1"/>
+            </w:tcBorders>
+            <w:shd w:fill="FFFFFF" w:val="clear"/>
+            <w:tcMar>
+              <w:top w:type="dxa" w:w="80"/>
+              <w:left w:type="dxa" w:w="120"/>
+              <w:bottom w:type="dxa" w:w="80"/>
+              <w:right w:type="dxa" w:w="120"/>
+            </w:tcMar>
+          </w:tcPr>
+          <w:p>
+            <w:r>
+              <w:rPr>
+                <w:rFonts w:ascii="Arial" w:cs="Arial" w:eastAsia="Arial" w:hAnsi="Arial"/>
+                <w:sz w:val="20"/>
+                <w:szCs w:val="20"/>
+              </w:rPr>
+              <w:t xml:space="preserve">protobuf==3.20.3 pinned in requirements.txt</w:t>
             </w:r>
           </w:p>
         </w:tc>

</xml_diff>